<commit_message>
Resume: Risk Analyst @ Mott MacDonald (MNC)
</commit_message>
<xml_diff>
--- a/resumes/Resume_Risk_Analyst_Mott_MacDonald__MNC_.docx
+++ b/resumes/Resume_Risk_Analyst_Mott_MacDonald__MNC_.docx
@@ -4,7 +4,7 @@
   <w:body>
     <w:p>
       <w:pPr>
-        <w:spacing w:after="44"/>
+        <w:spacing w:after="0" w:before="20"/>
         <w:jc w:val="center"/>
       </w:pPr>
       <w:r>
@@ -21,6 +21,7 @@
     </w:p>
     <w:p>
       <w:pPr>
+        <w:spacing w:before="20" w:after="0"/>
         <w:jc w:val="center"/>
       </w:pPr>
       <w:r>
@@ -116,7 +117,7 @@
         <w:pBdr>
           <w:bottom w:val="single" w:sz="6" w:space="1" w:color="000000"/>
         </w:pBdr>
-        <w:spacing w:before="360" w:after="52"/>
+        <w:spacing w:before="20" w:after="0"/>
       </w:pPr>
       <w:r>
         <w:rPr>
@@ -135,7 +136,7 @@
         <w:tabs>
           <w:tab w:val="right" w:pos="10800"/>
         </w:tabs>
-        <w:spacing w:before="62"/>
+        <w:spacing w:before="20" w:after="0"/>
       </w:pPr>
       <w:r>
         <w:rPr>
@@ -168,7 +169,7 @@
     </w:p>
     <w:p>
       <w:pPr>
-        <w:spacing w:before="8"/>
+        <w:spacing w:before="8" w:after="0"/>
       </w:pPr>
       <w:r>
         <w:rPr>
@@ -187,7 +188,7 @@
         <w:tabs>
           <w:tab w:val="right" w:pos="10800"/>
         </w:tabs>
-        <w:spacing w:before="62"/>
+        <w:spacing w:before="20" w:after="0"/>
       </w:pPr>
       <w:r>
         <w:rPr>
@@ -220,7 +221,7 @@
     </w:p>
     <w:p>
       <w:pPr>
-        <w:spacing w:before="8"/>
+        <w:spacing w:before="8" w:after="0"/>
       </w:pPr>
       <w:r>
         <w:rPr>
@@ -239,7 +240,7 @@
         <w:tabs>
           <w:tab w:val="right" w:pos="10800"/>
         </w:tabs>
-        <w:spacing w:before="62"/>
+        <w:spacing w:before="20" w:after="0"/>
       </w:pPr>
       <w:r>
         <w:rPr>
@@ -272,7 +273,7 @@
     </w:p>
     <w:p>
       <w:pPr>
-        <w:spacing w:before="8"/>
+        <w:spacing w:before="8" w:after="0"/>
       </w:pPr>
       <w:r>
         <w:rPr>
@@ -288,7 +289,7 @@
     </w:p>
     <w:p>
       <w:pPr>
-        <w:spacing w:before="8"/>
+        <w:spacing w:before="0" w:after="0"/>
       </w:pPr>
     </w:p>
     <w:p>
@@ -296,7 +297,7 @@
         <w:pBdr>
           <w:bottom w:val="single" w:sz="6" w:space="1" w:color="000000"/>
         </w:pBdr>
-        <w:spacing w:before="155" w:after="52"/>
+        <w:spacing w:before="20" w:after="0"/>
       </w:pPr>
       <w:r>
         <w:rPr>
@@ -315,7 +316,7 @@
         <w:tabs>
           <w:tab w:val="right" w:pos="10800"/>
         </w:tabs>
-        <w:spacing w:before="62"/>
+        <w:spacing w:before="20" w:after="0"/>
       </w:pPr>
       <w:r>
         <w:rPr>
@@ -359,7 +360,7 @@
         <w:tabs>
           <w:tab w:val="right" w:pos="10800"/>
         </w:tabs>
-        <w:spacing w:before="8"/>
+        <w:spacing w:before="8" w:after="0"/>
       </w:pPr>
       <w:r>
         <w:rPr>
@@ -412,7 +413,7 @@
           <w:sz w:val="19"/>
           <w:szCs w:val="19"/>
         </w:rPr>
-        <w:t>Triaged 50+ weekly inventory reimbursement cases by severity &amp; policy eligibility, mirroring SOC Tier 1 analyst workflow.</w:t>
+        <w:t>Conducted risk analysis and assessment on 50+ weekly inventory reimbursement cases by severity and policy eligibility.</w:t>
       </w:r>
       <w:proofErr w:type="spellStart"/>
       <w:r>
@@ -449,7 +450,7 @@
           <w:sz w:val="19"/>
           <w:szCs w:val="19"/>
         </w:rPr>
-        <w:t>Conducted root cause analysis on seller claims to identify policy violations &amp; anomalous patterns; escalated findings to senior reviewers.</w:t>
+        <w:t>Conducted root cause analysis on seller claims, identifying policy violations and anomalous patterns, and escalated findings to senior reviewers.</w:t>
       </w:r>
     </w:p>
     <w:p>
@@ -468,26 +469,7 @@
           <w:sz w:val="19"/>
           <w:szCs w:val="19"/>
         </w:rPr>
-        <w:t>Maintained audit-ready case documentation recording investigation findings, decisions, &amp; corrective actions for security incident reporting.</w:t>
-      </w:r>
-    </w:p>
-    <w:p>
-      <w:pPr>
-        <w:pStyle w:val="ListParagraph"/>
-        <w:numPr>
-          <w:ilvl w:val="0"/>
-          <w:numId w:val="2"/>
-        </w:numPr>
-        <w:spacing w:before="13" w:after="13"/>
-      </w:pPr>
-      <w:r>
-        <w:rPr>
-          <w:rFonts w:ascii="Source Sans Pro" w:eastAsia="Source Sans Pro" w:hAnsi="Source Sans Pro" w:cs="Source Sans Pro"/>
-          <w:color w:val="000000"/>
-          <w:sz w:val="19"/>
-          <w:szCs w:val="19"/>
-        </w:rPr>
-        <w:t>Collaborated with compliance &amp; risk teams to enforce regulatory policies, identify process control gaps, &amp; implement corrective actions.</w:t>
+        <w:t>Maintained audit-ready case documentation, recording investigation findings, decisions, and corrective actions to ensure regulatory compliance and security incident reporting.</w:t>
       </w:r>
     </w:p>
     <w:p>
@@ -495,7 +477,7 @@
         <w:pBdr>
           <w:bottom w:val="single" w:sz="6" w:space="1" w:color="000000"/>
         </w:pBdr>
-        <w:spacing w:before="155" w:after="52"/>
+        <w:spacing w:before="0" w:after="0"/>
         <w:rPr>
           <w:rFonts w:ascii="Source Sans Pro" w:eastAsia="Source Sans Pro" w:hAnsi="Source Sans Pro" w:cs="Source Sans Pro"/>
           <w:b/>
@@ -511,7 +493,7 @@
         <w:pBdr>
           <w:bottom w:val="single" w:sz="6" w:space="1" w:color="000000"/>
         </w:pBdr>
-        <w:spacing w:before="155" w:after="52"/>
+        <w:spacing w:before="20" w:after="0"/>
       </w:pPr>
       <w:r>
         <w:rPr>
@@ -530,7 +512,7 @@
         <w:tabs>
           <w:tab w:val="right" w:pos="10800"/>
         </w:tabs>
-        <w:spacing w:before="62"/>
+        <w:spacing w:before="20" w:after="0"/>
       </w:pPr>
       <w:proofErr w:type="spellStart"/>
       <w:proofErr w:type="spellEnd"/>
@@ -544,7 +526,7 @@
             <w:color w:val="000000"/>
             <w:u w:val="single"/>
           </w:rPr>
-          <w:t>Phishing &amp; OSINT Threat Intelligence Tool</w:t>
+          <w:t>Phishing and OSINT Threat Intelligence Tool</w:t>
         </w:r>
       </w:hyperlink>
       <w:r>
@@ -581,7 +563,7 @@
           <w:sz w:val="19"/>
           <w:szCs w:val="19"/>
         </w:rPr>
-        <w:t>Built multi-API threat intelligence pipeline using VirusTotal, AbuseIPDB, &amp; WHOIS to produce phishing probability score.</w:t>
+        <w:t>Built multi-API threat intelligence pipeline: submits suspicious data to VirusTotal, AbuseIPDB, and URLScan.io; cross-references WHOIS, DNS, and SSL details to produce a unified phishing probability score using Python and API integrations.</w:t>
       </w:r>
     </w:p>
     <w:p>
@@ -600,7 +582,7 @@
           <w:sz w:val="19"/>
           <w:szCs w:val="19"/>
         </w:rPr>
-        <w:t>Implemented typosquatting domain detector generating character-substitution variants of brand domains &amp; checking live DNS resolution.</w:t>
+        <w:t>Developed typosquatting detector generating domain variants and checking DNS resolution, leveraging VirusTotal API and AbuseIPDB for brand-impersonation attack detection.</w:t>
       </w:r>
     </w:p>
     <w:p>
@@ -619,7 +601,7 @@
           <w:sz w:val="19"/>
           <w:szCs w:val="19"/>
         </w:rPr>
-        <w:t>Deployed Telegram bot interface enabling analysts to submit URLs for live IOC enrichment &amp; OSINT enrichment via theHarvester.</w:t>
+        <w:t>Deployed Telegram bot interface for live IOC enrichment, supporting bulk CSV input/output and OSINT enrichment via theHarvester for domain profiling.</w:t>
       </w:r>
       <w:proofErr w:type="spellStart"/>
       <w:r>
@@ -660,7 +642,7 @@
     </w:p>
     <w:p>
       <w:pPr>
-        <w:spacing w:before="30"/>
+        <w:spacing w:before="0" w:after="0"/>
       </w:pPr>
     </w:p>
     <w:p>
@@ -668,7 +650,7 @@
         <w:tabs>
           <w:tab w:val="right" w:pos="10800"/>
         </w:tabs>
-        <w:spacing w:before="30"/>
+        <w:spacing w:before="30" w:after="0"/>
       </w:pPr>
       <w:hyperlink r:id="rId14">
         <w:r>
@@ -680,7 +662,7 @@
             <w:color w:val="000000"/>
             <w:u w:val="single"/>
           </w:rPr>
-          <w:t>Vulnerability Scanner &amp; Patch Prioritization Engine</w:t>
+          <w:t>Vulnerability Scanner and Patch Prioritization Engine</w:t>
         </w:r>
       </w:hyperlink>
       <w:r>
@@ -717,7 +699,7 @@
           <w:sz w:val="19"/>
           <w:szCs w:val="19"/>
         </w:rPr>
-        <w:t>Built automated vulnerability assessment pipeline integrating Nessus &amp; OpenVAS REST APIs in Python; classified CVE reports by CVSS severity.</w:t>
+        <w:t>Developed automated vulnerability assessment pipeline using Nessus and OpenVAS REST APIs in Python, integrating EPSS scoring from FIRST.org API and CVSS severity for prioritisation.</w:t>
       </w:r>
     </w:p>
     <w:p>
@@ -736,7 +718,7 @@
           <w:sz w:val="19"/>
           <w:szCs w:val="19"/>
         </w:rPr>
-        <w:t>Developed OWASP Top 10 automated web checker detecting injection, broken auth, &amp; SSRF vulnerabilities; documented SQL injection remediation.</w:t>
+        <w:t>Developed OWASP Top 10 automated web checker using Python and Bash to detect injection, auth, and SSRF vulnerabilities.</w:t>
       </w:r>
     </w:p>
     <w:p>
@@ -755,7 +737,7 @@
           <w:sz w:val="19"/>
           <w:szCs w:val="19"/>
         </w:rPr>
-        <w:t>Automated scan scheduling via Bash &amp; cron; built delta-scan logic to flag newly discovered CVEs &amp; calculate remediation SLA deadlines.</w:t>
+        <w:t>Automated scan scheduling via Bash and cron; built delta-scan logic for CVE flagging and remediation SLA deadlines (Critical=24hrs, High=7 days, Medium=30 days) using Nessus and OpenVAS APIs.</w:t>
       </w:r>
     </w:p>
     <w:p>
@@ -763,7 +745,7 @@
         <w:pBdr>
           <w:bottom w:val="single" w:sz="6" w:space="1" w:color="000000"/>
         </w:pBdr>
-        <w:spacing w:before="155" w:after="52"/>
+        <w:spacing w:before="0" w:after="0"/>
         <w:rPr>
           <w:rFonts w:ascii="Source Sans Pro" w:eastAsia="Source Sans Pro" w:hAnsi="Source Sans Pro" w:cs="Source Sans Pro"/>
           <w:b/>
@@ -779,7 +761,7 @@
         <w:pBdr>
           <w:bottom w:val="single" w:sz="6" w:space="1" w:color="000000"/>
         </w:pBdr>
-        <w:spacing w:before="155" w:after="52"/>
+        <w:spacing w:before="20" w:after="0"/>
       </w:pPr>
       <w:r>
         <w:rPr>
@@ -804,15 +786,15 @@
           <w:sz w:val="19"/>
           <w:szCs w:val="19"/>
         </w:rPr>
-        <w:t xml:space="preserve">SOC Operations: </w:t>
-      </w:r>
-      <w:r>
-        <w:rPr>
-          <w:rFonts w:ascii="Source Sans Pro" w:eastAsia="Source Sans Pro" w:hAnsi="Source Sans Pro" w:cs="Source Sans Pro"/>
-          <w:sz w:val="19"/>
-          <w:szCs w:val="19"/>
-        </w:rPr>
-        <w:t>GRC &amp; Compliance: NIST CSF, ISO 27001 (concepts), PCI-DSS, GDPR/PDPB, SOX/ITGC basics, compliance monitoring</w:t>
+        <w:t xml:space="preserve">GRC &amp; Compliance: </w:t>
+      </w:r>
+      <w:r>
+        <w:rPr>
+          <w:rFonts w:ascii="Source Sans Pro" w:eastAsia="Source Sans Pro" w:hAnsi="Source Sans Pro" w:cs="Source Sans Pro"/>
+          <w:sz w:val="19"/>
+          <w:szCs w:val="19"/>
+        </w:rPr>
+        <w:t>NIST CSF, ISO 27001, PCI-DSS, GDPR/PDPB, SOX/ITGC, compliance monitoring</w:t>
       </w:r>
     </w:p>
     <w:p>
@@ -826,15 +808,15 @@
           <w:sz w:val="19"/>
           <w:szCs w:val="19"/>
         </w:rPr>
-        <w:t xml:space="preserve">SIEM &amp; Monitoring: </w:t>
-      </w:r>
-      <w:r>
-        <w:rPr>
-          <w:rFonts w:ascii="Source Sans Pro" w:eastAsia="Source Sans Pro" w:hAnsi="Source Sans Pro" w:cs="Source Sans Pro"/>
-          <w:sz w:val="19"/>
-          <w:szCs w:val="19"/>
-        </w:rPr>
-        <w:t>Risk &amp; Audit: Risk assessment, control testing, audit documentation, vendor risk, RCSA basics, third-party risk</w:t>
+        <w:t xml:space="preserve">Risk &amp; Audit: </w:t>
+      </w:r>
+      <w:r>
+        <w:rPr>
+          <w:rFonts w:ascii="Source Sans Pro" w:eastAsia="Source Sans Pro" w:hAnsi="Source Sans Pro" w:cs="Source Sans Pro"/>
+          <w:sz w:val="19"/>
+          <w:szCs w:val="19"/>
+        </w:rPr>
+        <w:t>Risk assessment, control testing, audit documentation, vendor risk, RCSA basics</w:t>
       </w:r>
     </w:p>
     <w:p>
@@ -848,15 +830,15 @@
           <w:sz w:val="19"/>
           <w:szCs w:val="19"/>
         </w:rPr>
-        <w:t xml:space="preserve">Threat Intelligence: </w:t>
-      </w:r>
-      <w:r>
-        <w:rPr>
-          <w:rFonts w:ascii="Source Sans Pro" w:eastAsia="Source Sans Pro" w:hAnsi="Source Sans Pro" w:cs="Source Sans Pro"/>
-          <w:sz w:val="19"/>
-          <w:szCs w:val="19"/>
-        </w:rPr>
-        <w:t>Fraud &amp; AML: Transaction monitoring, AML typologies, KYC/CDD, sanctions screening, financial crime indicators</w:t>
+        <w:t xml:space="preserve">Fraud &amp; AML: </w:t>
+      </w:r>
+      <w:r>
+        <w:rPr>
+          <w:rFonts w:ascii="Source Sans Pro" w:eastAsia="Source Sans Pro" w:hAnsi="Source Sans Pro" w:cs="Source Sans Pro"/>
+          <w:sz w:val="19"/>
+          <w:szCs w:val="19"/>
+        </w:rPr>
+        <w:t>Transaction monitoring, AML typologies, KYC/CDD, sanctions screening</w:t>
       </w:r>
     </w:p>
     <w:p>
@@ -870,15 +852,15 @@
           <w:sz w:val="19"/>
           <w:szCs w:val="19"/>
         </w:rPr>
-        <w:t xml:space="preserve">Systems &amp; Networking: </w:t>
-      </w:r>
-      <w:r>
-        <w:rPr>
-          <w:rFonts w:ascii="Source Sans Pro" w:eastAsia="Source Sans Pro" w:hAnsi="Source Sans Pro" w:cs="Source Sans Pro"/>
-          <w:sz w:val="19"/>
-          <w:szCs w:val="19"/>
-        </w:rPr>
-        <w:t>Systems &amp; Tools: Python, Excel (pivot, VLOOKUP), SQL (basic), Linux fundamentals, Windows internals</w:t>
+        <w:t xml:space="preserve">Systems &amp; Tools: </w:t>
+      </w:r>
+      <w:r>
+        <w:rPr>
+          <w:rFonts w:ascii="Source Sans Pro" w:eastAsia="Source Sans Pro" w:hAnsi="Source Sans Pro" w:cs="Source Sans Pro"/>
+          <w:sz w:val="19"/>
+          <w:szCs w:val="19"/>
+        </w:rPr>
+        <w:t>Windows internals, Linux fundamentals, Python, Excel, SQL (basic), TCP/IP basics</w:t>
       </w:r>
     </w:p>
     <w:p>
@@ -892,15 +874,15 @@
           <w:sz w:val="19"/>
           <w:szCs w:val="19"/>
         </w:rPr>
-        <w:t xml:space="preserve">Automation: </w:t>
-      </w:r>
-      <w:r>
-        <w:rPr>
-          <w:rFonts w:ascii="Source Sans Pro" w:eastAsia="Source Sans Pro" w:hAnsi="Source Sans Pro" w:cs="Source Sans Pro"/>
-          <w:sz w:val="19"/>
-          <w:szCs w:val="19"/>
-        </w:rPr>
-        <w:t>Frameworks: MITRE ATT&amp;CK, OWASP Top 10, Incident Response (PICERL), audit trail documentation</w:t>
+        <w:t xml:space="preserve">Frameworks: </w:t>
+      </w:r>
+      <w:r>
+        <w:rPr>
+          <w:rFonts w:ascii="Source Sans Pro" w:eastAsia="Source Sans Pro" w:hAnsi="Source Sans Pro" w:cs="Source Sans Pro"/>
+          <w:sz w:val="19"/>
+          <w:szCs w:val="19"/>
+        </w:rPr>
+        <w:t>MITRE ATT&amp;CK, OWASP Top 10, Incident Response (PICERL), audit trail documentation, Analysis, Analysis, Management</w:t>
       </w:r>
     </w:p>
     <w:p>
@@ -908,7 +890,7 @@
         <w:pBdr>
           <w:bottom w:val="single" w:sz="6" w:space="1" w:color="000000"/>
         </w:pBdr>
-        <w:spacing w:before="155" w:after="52"/>
+        <w:spacing w:before="0" w:after="0"/>
         <w:rPr>
           <w:rFonts w:ascii="Source Sans Pro" w:eastAsia="Source Sans Pro" w:hAnsi="Source Sans Pro" w:cs="Source Sans Pro"/>
           <w:b/>
@@ -924,7 +906,7 @@
         <w:pBdr>
           <w:bottom w:val="single" w:sz="6" w:space="1" w:color="000000"/>
         </w:pBdr>
-        <w:spacing w:before="155" w:after="52"/>
+        <w:spacing w:before="20" w:after="0"/>
       </w:pPr>
       <w:r>
         <w:rPr>

</xml_diff>